<commit_message>
2026-08-09 Hockey Predictions Fetch
</commit_message>
<xml_diff>
--- a/Python/Resume Building/2026/jobs applied to.docx
+++ b/Python/Resume Building/2026/jobs applied to.docx
@@ -1,6 +1,6 @@
 
 <file path=word/document.xml><?xml version="1.0" encoding="utf-8"?>
-<w:document xmlns:wpc="http://schemas.microsoft.com/office/word/2010/wordprocessingCanvas" xmlns:cx="http://schemas.microsoft.com/office/drawing/2014/chartex" xmlns:cx1="http://schemas.microsoft.com/office/drawing/2015/9/8/chartex" xmlns:cx2="http://schemas.microsoft.com/office/drawing/2015/10/21/chartex" xmlns:cx3="http://schemas.microsoft.com/office/drawing/2016/5/9/chartex" xmlns:cx4="http://schemas.microsoft.com/office/drawing/2016/5/10/chartex" xmlns:cx5="http://schemas.microsoft.com/office/drawing/2016/5/11/chartex" xmlns:cx6="http://schemas.microsoft.com/office/drawing/2016/5/12/chartex" xmlns:cx7="http://schemas.microsoft.com/office/drawing/2016/5/13/chartex" xmlns:cx8="http://schemas.microsoft.com/office/drawing/2016/5/14/chartex" xmlns:mc="http://schemas.openxmlformats.org/markup-compatibility/2006" xmlns:aink="http://schemas.microsoft.com/office/drawing/2016/ink" xmlns:am3d="http://schemas.microsoft.com/office/drawing/2017/model3d" xmlns:o="urn:schemas-microsoft-com:office:office" xmlns:oel="http://schemas.microsoft.com/office/2019/extlst" xmlns:r="http://schemas.openxmlformats.org/officeDocument/2006/relationships" xmlns:m="http://schemas.openxmlformats.org/officeDocument/2006/math" xmlns:v="urn:schemas-microsoft-com:vml" xmlns:wp14="http://schemas.microsoft.com/office/word/2010/wordprocessingDrawing" xmlns:wp="http://schemas.openxmlformats.org/drawingml/2006/wordprocessingDrawing" xmlns:w10="urn:schemas-microsoft-com:office:word" xmlns:w="http://schemas.openxmlformats.org/wordprocessingml/2006/main" xmlns:w14="http://schemas.microsoft.com/office/word/2010/wordml" xmlns:w15="http://schemas.microsoft.com/office/word/2012/wordml" xmlns:w16cex="http://schemas.microsoft.com/office/word/2018/wordml/cex" xmlns:w16cid="http://schemas.microsoft.com/office/word/2016/wordml/cid" xmlns:w16="http://schemas.microsoft.com/office/word/2018/wordml" xmlns:w16du="http://schemas.microsoft.com/office/word/2023/wordml/word16du" xmlns:w16sdtdh="http://schemas.microsoft.com/office/word/2020/wordml/sdtdatahash" xmlns:w16sdtfl="http://schemas.microsoft.com/office/word/2024/wordml/sdtformatlock" xmlns:w16se="http://schemas.microsoft.com/office/word/2015/wordml/symex" xmlns:wpg="http://schemas.microsoft.com/office/word/2010/wordprocessingGroup" xmlns:wpi="http://schemas.microsoft.com/office/word/2010/wordprocessingInk" xmlns:wne="http://schemas.microsoft.com/office/word/2006/wordml" xmlns:wps="http://schemas.microsoft.com/office/word/2010/wordprocessingShape" mc:Ignorable="w14 w15 w16se w16cid w16 w16cex w16sdtdh w16sdtfl w16du wp14">
+<w:document xmlns:wpc="http://schemas.microsoft.com/office/word/2010/wordprocessingCanvas" xmlns:cx="http://schemas.microsoft.com/office/drawing/2014/chartex" xmlns:cx1="http://schemas.microsoft.com/office/drawing/2015/9/8/chartex" xmlns:cx2="http://schemas.microsoft.com/office/drawing/2015/10/21/chartex" xmlns:cx3="http://schemas.microsoft.com/office/drawing/2016/5/9/chartex" xmlns:cx4="http://schemas.microsoft.com/office/drawing/2016/5/10/chartex" xmlns:cx5="http://schemas.microsoft.com/office/drawing/2016/5/11/chartex" xmlns:cx6="http://schemas.microsoft.com/office/drawing/2016/5/12/chartex" xmlns:cx7="http://schemas.microsoft.com/office/drawing/2016/5/13/chartex" xmlns:cx8="http://schemas.microsoft.com/office/drawing/2016/5/14/chartex" xmlns:mc="http://schemas.openxmlformats.org/markup-compatibility/2006" xmlns:aink="http://schemas.microsoft.com/office/drawing/2016/ink" xmlns:am3d="http://schemas.microsoft.com/office/drawing/2017/model3d" xmlns:o="urn:schemas-microsoft-com:office:office" xmlns:oel="http://schemas.microsoft.com/office/2019/extlst" xmlns:r="http://schemas.openxmlformats.org/officeDocument/2006/relationships" xmlns:m="http://schemas.openxmlformats.org/officeDocument/2006/math" xmlns:v="urn:schemas-microsoft-com:vml" xmlns:wp14="http://schemas.microsoft.com/office/word/2010/wordprocessingDrawing" xmlns:wp="http://schemas.openxmlformats.org/drawingml/2006/wordprocessingDrawing" xmlns:w10="urn:schemas-microsoft-com:office:word" xmlns:w="http://schemas.openxmlformats.org/wordprocessingml/2006/main" xmlns:w14="http://schemas.microsoft.com/office/word/2010/wordml" xmlns:w15="http://schemas.microsoft.com/office/word/2012/wordml" xmlns:w16cei="http://schemas.microsoft.com/office/word/2026/wordml/cei" xmlns:w16cex="http://schemas.microsoft.com/office/word/2018/wordml/cex" xmlns:w16cid="http://schemas.microsoft.com/office/word/2016/wordml/cid" xmlns:w16="http://schemas.microsoft.com/office/word/2018/wordml" xmlns:w16du="http://schemas.microsoft.com/office/word/2023/wordml/word16du" xmlns:w16sdtdh="http://schemas.microsoft.com/office/word/2020/wordml/sdtdatahash" xmlns:w16sdtfl="http://schemas.microsoft.com/office/word/2024/wordml/sdtformatlock" xmlns:w16se="http://schemas.microsoft.com/office/word/2015/wordml/symex" xmlns:wpg="http://schemas.microsoft.com/office/word/2010/wordprocessingGroup" xmlns:wpi="http://schemas.microsoft.com/office/word/2010/wordprocessingInk" xmlns:wne="http://schemas.microsoft.com/office/word/2006/wordml" xmlns:wps="http://schemas.microsoft.com/office/word/2010/wordprocessingShape" mc:Ignorable="w14 w15 w16se w16cid w16 w16cex w16sdtdh w16sdtfl w16du wp14">
   <w:body>
     <w:tbl>
       <w:tblPr>
@@ -2000,6 +2000,69 @@
           <w:p>
             <w:r>
               <w:t>Remote</w:t>
+            </w:r>
+          </w:p>
+        </w:tc>
+        <w:tc>
+          <w:tcPr>
+            <w:tcW w:w="1683" w:type="dxa"/>
+          </w:tcPr>
+          <w:p/>
+        </w:tc>
+      </w:tr>
+      <w:tr>
+        <w:trPr>
+          <w:trHeight w:val="289"/>
+        </w:trPr>
+        <w:tc>
+          <w:tcPr>
+            <w:tcW w:w="460" w:type="dxa"/>
+          </w:tcPr>
+          <w:p>
+            <w:r>
+              <w:t>26</w:t>
+            </w:r>
+          </w:p>
+        </w:tc>
+        <w:tc>
+          <w:tcPr>
+            <w:tcW w:w="1525" w:type="dxa"/>
+          </w:tcPr>
+          <w:p>
+            <w:r>
+              <w:t>2026-08-07</w:t>
+            </w:r>
+          </w:p>
+        </w:tc>
+        <w:tc>
+          <w:tcPr>
+            <w:tcW w:w="3827" w:type="dxa"/>
+          </w:tcPr>
+          <w:p>
+            <w:r>
+              <w:t>Inventory Analyst</w:t>
+            </w:r>
+          </w:p>
+        </w:tc>
+        <w:tc>
+          <w:tcPr>
+            <w:tcW w:w="5387" w:type="dxa"/>
+          </w:tcPr>
+          <w:p>
+            <w:proofErr w:type="spellStart"/>
+            <w:r>
+              <w:t>SearchVelocity</w:t>
+            </w:r>
+            <w:proofErr w:type="spellEnd"/>
+          </w:p>
+        </w:tc>
+        <w:tc>
+          <w:tcPr>
+            <w:tcW w:w="2693" w:type="dxa"/>
+          </w:tcPr>
+          <w:p>
+            <w:r>
+              <w:t>Peel, N.B.</w:t>
             </w:r>
           </w:p>
         </w:tc>

</xml_diff>